<commit_message>
Update business rules and project documentation for El Bambú management system
- Revised business rules document to version 2.0, enhancing clarity and detail in product registration, supplier management, and inventory control.
- Updated vision and scope document to correct author names, improve structure, and refine objectives and success metrics.
- Adjusted additional documentation to reflect architectural decisions and database management.
- Modified scope documents to replace "reservations" with "contracts" for consistency across project materials.
- Expanded objectives section to include specific criteria for success, focusing on automation, efficiency, and error reduction.
- Provided a detailed description of the current system's limitations and processes, emphasizing the need for the new management system.
</commit_message>
<xml_diff>
--- a/docs/Documento de Reglas de Negocio.docx
+++ b/docs/Documento de Reglas de Negocio.docx
@@ -15,16 +15,16 @@
       <w:pPr>
         <w:pStyle w:val="Ttulo"/>
         <w:rPr>
-          <w:rFonts w:eastAsia="Arial" w:cs="Arial"/>
-          <w:sz w:val="48"/>
-          <w:szCs w:val="48"/>
+          <w:rFonts w:ascii="Times New Roman" w:hAnsi="Times New Roman"/>
+          <w:sz w:val="56"/>
+          <w:szCs w:val="56"/>
         </w:rPr>
       </w:pPr>
       <w:r>
         <w:rPr>
-          <w:rFonts w:eastAsia="Arial" w:cs="Arial"/>
-          <w:sz w:val="48"/>
-          <w:szCs w:val="48"/>
+          <w:rFonts w:ascii="Times New Roman" w:hAnsi="Times New Roman"/>
+          <w:sz w:val="56"/>
+          <w:szCs w:val="56"/>
         </w:rPr>
         <w:t>Documento de Reglas de Negocio</w:t>
       </w:r>
@@ -32,53 +32,79 @@
     <w:p>
       <w:pPr>
         <w:pStyle w:val="Ttulo"/>
-        <w:spacing w:before="0" w:after="400"/>
         <w:rPr>
-          <w:rFonts w:eastAsia="Arial" w:cs="Arial"/>
-          <w:sz w:val="40"/>
-          <w:szCs w:val="40"/>
+          <w:rFonts w:ascii="Times New Roman" w:hAnsi="Times New Roman"/>
+          <w:sz w:val="56"/>
+          <w:szCs w:val="56"/>
         </w:rPr>
       </w:pPr>
       <w:r>
         <w:rPr>
-          <w:rFonts w:eastAsia="Arial" w:cs="Arial"/>
-          <w:sz w:val="40"/>
-          <w:szCs w:val="40"/>
+          <w:rFonts w:ascii="Times New Roman" w:hAnsi="Times New Roman"/>
+          <w:sz w:val="56"/>
+          <w:szCs w:val="56"/>
         </w:rPr>
         <w:t>para</w:t>
       </w:r>
     </w:p>
     <w:p>
       <w:pPr>
-        <w:pStyle w:val="ByLine"/>
-        <w:spacing w:after="0"/>
+        <w:pStyle w:val="Ttulo"/>
         <w:rPr>
-          <w:rFonts w:eastAsia="Arial" w:cs="Arial"/>
-          <w:sz w:val="52"/>
-          <w:szCs w:val="52"/>
+          <w:rFonts w:ascii="Times New Roman" w:hAnsi="Times New Roman"/>
+          <w:sz w:val="56"/>
+          <w:szCs w:val="56"/>
         </w:rPr>
       </w:pPr>
       <w:r>
         <w:rPr>
-          <w:rFonts w:eastAsia="Arial" w:cs="Arial"/>
-          <w:sz w:val="52"/>
-          <w:szCs w:val="52"/>
+          <w:rFonts w:ascii="Times New Roman" w:hAnsi="Times New Roman"/>
+          <w:sz w:val="56"/>
+          <w:szCs w:val="56"/>
         </w:rPr>
         <w:t>Sistema de gestión interna El Bambú</w:t>
       </w:r>
     </w:p>
     <w:p>
       <w:pPr>
-        <w:pStyle w:val="ByLine"/>
+        <w:pStyle w:val="Ttulo"/>
         <w:rPr>
-          <w:rFonts w:eastAsia="Arial" w:cs="Arial"/>
+          <w:rFonts w:ascii="Times New Roman" w:hAnsi="Times New Roman"/>
+          <w:sz w:val="32"/>
+          <w:szCs w:val="32"/>
         </w:rPr>
       </w:pPr>
       <w:r>
         <w:rPr>
-          <w:rFonts w:eastAsia="Arial" w:cs="Arial"/>
+          <w:rFonts w:ascii="Times New Roman" w:hAnsi="Times New Roman"/>
+          <w:sz w:val="32"/>
+          <w:szCs w:val="32"/>
         </w:rPr>
-        <w:t xml:space="preserve">Versión 1.1 </w:t>
+        <w:t xml:space="preserve">Versión </w:t>
+      </w:r>
+      <w:r>
+        <w:rPr>
+          <w:rFonts w:ascii="Times New Roman" w:hAnsi="Times New Roman"/>
+          <w:sz w:val="32"/>
+          <w:szCs w:val="32"/>
+        </w:rPr>
+        <w:t>2</w:t>
+      </w:r>
+      <w:r>
+        <w:rPr>
+          <w:rFonts w:ascii="Times New Roman" w:hAnsi="Times New Roman"/>
+          <w:sz w:val="32"/>
+          <w:szCs w:val="32"/>
+        </w:rPr>
+        <w:t>.0</w:t>
+      </w:r>
+      <w:r>
+        <w:rPr>
+          <w:rFonts w:ascii="Times New Roman" w:hAnsi="Times New Roman"/>
+          <w:sz w:val="32"/>
+          <w:szCs w:val="32"/>
+        </w:rPr>
+        <w:t xml:space="preserve"> </w:t>
       </w:r>
     </w:p>
     <w:p>
@@ -86,14 +112,14 @@
         <w:pStyle w:val="ByLine"/>
         <w:spacing w:after="0"/>
         <w:rPr>
-          <w:rFonts w:eastAsia="Arial" w:cs="Arial"/>
+          <w:rFonts w:ascii="Times New Roman" w:eastAsia="Arial" w:hAnsi="Times New Roman"/>
           <w:sz w:val="36"/>
           <w:szCs w:val="36"/>
         </w:rPr>
       </w:pPr>
       <w:r>
         <w:rPr>
-          <w:rFonts w:eastAsia="Arial" w:cs="Arial"/>
+          <w:rFonts w:ascii="Times New Roman" w:eastAsia="Arial" w:hAnsi="Times New Roman"/>
           <w:sz w:val="36"/>
           <w:szCs w:val="36"/>
         </w:rPr>
@@ -105,16 +131,16 @@
         <w:pStyle w:val="ByLine"/>
         <w:spacing w:after="0"/>
         <w:rPr>
-          <w:rFonts w:eastAsia="Arial" w:cs="Arial"/>
-          <w:bCs/>
+          <w:rFonts w:ascii="Times New Roman" w:eastAsia="Arial" w:hAnsi="Times New Roman"/>
+          <w:b w:val="0"/>
           <w:sz w:val="32"/>
           <w:szCs w:val="32"/>
         </w:rPr>
       </w:pPr>
       <w:r>
         <w:rPr>
-          <w:rFonts w:eastAsia="Arial" w:cs="Arial"/>
-          <w:bCs/>
+          <w:rFonts w:ascii="Times New Roman" w:eastAsia="Arial" w:hAnsi="Times New Roman"/>
+          <w:b w:val="0"/>
           <w:sz w:val="32"/>
           <w:szCs w:val="32"/>
         </w:rPr>
@@ -126,16 +152,16 @@
         <w:pStyle w:val="ByLine"/>
         <w:spacing w:after="0"/>
         <w:rPr>
-          <w:rFonts w:eastAsia="Arial" w:cs="Arial"/>
-          <w:bCs/>
+          <w:rFonts w:ascii="Times New Roman" w:eastAsia="Arial" w:hAnsi="Times New Roman"/>
+          <w:b w:val="0"/>
           <w:sz w:val="32"/>
           <w:szCs w:val="32"/>
         </w:rPr>
       </w:pPr>
       <w:r>
         <w:rPr>
-          <w:rFonts w:eastAsia="Arial" w:cs="Arial"/>
-          <w:bCs/>
+          <w:rFonts w:ascii="Times New Roman" w:eastAsia="Arial" w:hAnsi="Times New Roman"/>
+          <w:b w:val="0"/>
           <w:sz w:val="32"/>
           <w:szCs w:val="32"/>
         </w:rPr>
@@ -147,16 +173,16 @@
         <w:pStyle w:val="ByLine"/>
         <w:spacing w:after="0"/>
         <w:rPr>
-          <w:rFonts w:eastAsia="Arial" w:cs="Arial"/>
-          <w:bCs/>
+          <w:rFonts w:ascii="Times New Roman" w:eastAsia="Arial" w:hAnsi="Times New Roman"/>
+          <w:b w:val="0"/>
           <w:sz w:val="32"/>
           <w:szCs w:val="32"/>
         </w:rPr>
       </w:pPr>
       <w:r>
         <w:rPr>
-          <w:rFonts w:eastAsia="Arial" w:cs="Arial"/>
-          <w:bCs/>
+          <w:rFonts w:ascii="Times New Roman" w:eastAsia="Arial" w:hAnsi="Times New Roman"/>
+          <w:b w:val="0"/>
           <w:sz w:val="32"/>
           <w:szCs w:val="32"/>
         </w:rPr>
@@ -168,16 +194,16 @@
         <w:pStyle w:val="ByLine"/>
         <w:spacing w:after="0"/>
         <w:rPr>
-          <w:rFonts w:eastAsia="Arial" w:cs="Arial"/>
-          <w:bCs/>
+          <w:rFonts w:ascii="Times New Roman" w:eastAsia="Arial" w:hAnsi="Times New Roman"/>
+          <w:b w:val="0"/>
           <w:sz w:val="32"/>
           <w:szCs w:val="32"/>
         </w:rPr>
       </w:pPr>
       <w:r>
         <w:rPr>
-          <w:rFonts w:eastAsia="Arial" w:cs="Arial"/>
-          <w:bCs/>
+          <w:rFonts w:ascii="Times New Roman" w:eastAsia="Arial" w:hAnsi="Times New Roman"/>
+          <w:b w:val="0"/>
           <w:sz w:val="32"/>
           <w:szCs w:val="32"/>
         </w:rPr>
@@ -197,8 +223,8 @@
       </w:pPr>
       <w:r>
         <w:rPr>
-          <w:rFonts w:eastAsia="Arial" w:cs="Arial"/>
-          <w:bCs/>
+          <w:rFonts w:ascii="Times New Roman" w:eastAsia="Arial" w:hAnsi="Times New Roman"/>
+          <w:b w:val="0"/>
           <w:sz w:val="32"/>
           <w:szCs w:val="32"/>
         </w:rPr>
@@ -209,7 +235,7 @@
       <w:pPr>
         <w:pStyle w:val="ByLine"/>
         <w:rPr>
-          <w:rFonts w:eastAsia="Arial" w:cs="Arial"/>
+          <w:rFonts w:ascii="Times New Roman" w:eastAsia="Arial" w:hAnsi="Times New Roman"/>
           <w:b w:val="0"/>
           <w:sz w:val="36"/>
           <w:szCs w:val="36"/>
@@ -217,7 +243,7 @@
       </w:pPr>
       <w:r>
         <w:rPr>
-          <w:rFonts w:eastAsia="Arial" w:cs="Arial"/>
+          <w:rFonts w:ascii="Times New Roman" w:eastAsia="Arial" w:hAnsi="Times New Roman"/>
           <w:sz w:val="36"/>
           <w:szCs w:val="36"/>
         </w:rPr>
@@ -228,7 +254,7 @@
       <w:pPr>
         <w:pStyle w:val="ByLine"/>
         <w:rPr>
-          <w:rFonts w:eastAsia="Arial" w:cs="Arial"/>
+          <w:rFonts w:ascii="Times New Roman" w:eastAsia="Arial" w:hAnsi="Times New Roman"/>
           <w:b w:val="0"/>
           <w:sz w:val="36"/>
           <w:szCs w:val="36"/>
@@ -236,7 +262,27 @@
       </w:pPr>
       <w:r>
         <w:rPr>
-          <w:rFonts w:eastAsia="Arial" w:cs="Arial"/>
+          <w:rFonts w:ascii="Times New Roman" w:hAnsi="Times New Roman"/>
+          <w:b w:val="0"/>
+          <w:bCs/>
+          <w:sz w:val="36"/>
+          <w:szCs w:val="24"/>
+        </w:rPr>
+        <w:t>28</w:t>
+      </w:r>
+      <w:r>
+        <w:rPr>
+          <w:rFonts w:ascii="Times New Roman" w:hAnsi="Times New Roman"/>
+          <w:b w:val="0"/>
+          <w:bCs/>
+          <w:sz w:val="36"/>
+          <w:szCs w:val="24"/>
+        </w:rPr>
+        <w:t xml:space="preserve"> de abril </w:t>
+      </w:r>
+      <w:r>
+        <w:rPr>
+          <w:rFonts w:ascii="Times New Roman" w:eastAsia="Arial" w:hAnsi="Times New Roman"/>
           <w:b w:val="0"/>
           <w:sz w:val="36"/>
           <w:szCs w:val="36"/>
@@ -245,7 +291,7 @@
       </w:r>
       <w:r>
         <w:rPr>
-          <w:rFonts w:eastAsia="Arial" w:cs="Arial"/>
+          <w:rFonts w:ascii="Times New Roman" w:eastAsia="Arial" w:hAnsi="Times New Roman"/>
           <w:b w:val="0"/>
           <w:sz w:val="36"/>
           <w:szCs w:val="36"/>
@@ -469,9 +515,6 @@
         <w:tc>
           <w:tcPr>
             <w:tcW w:w="2160" w:type="dxa"/>
-            <w:tcBorders>
-              <w:bottom w:val="single" w:sz="12" w:space="0" w:color="auto"/>
-            </w:tcBorders>
           </w:tcPr>
           <w:p>
             <w:pPr>
@@ -488,9 +531,6 @@
         <w:tc>
           <w:tcPr>
             <w:tcW w:w="1170" w:type="dxa"/>
-            <w:tcBorders>
-              <w:bottom w:val="single" w:sz="12" w:space="0" w:color="auto"/>
-            </w:tcBorders>
           </w:tcPr>
           <w:p>
             <w:pPr>
@@ -507,9 +547,6 @@
         <w:tc>
           <w:tcPr>
             <w:tcW w:w="5019" w:type="dxa"/>
-            <w:tcBorders>
-              <w:bottom w:val="single" w:sz="12" w:space="0" w:color="auto"/>
-            </w:tcBorders>
           </w:tcPr>
           <w:p>
             <w:pPr>
@@ -526,19 +563,109 @@
         <w:tc>
           <w:tcPr>
             <w:tcW w:w="1519" w:type="dxa"/>
-            <w:tcBorders>
-              <w:bottom w:val="single" w:sz="12" w:space="0" w:color="auto"/>
-            </w:tcBorders>
           </w:tcPr>
           <w:p>
             <w:pPr>
               <w:spacing w:before="40" w:after="40"/>
+              <w:rPr>
+                <w:color w:val="000000"/>
+              </w:rPr>
             </w:pPr>
             <w:r>
               <w:rPr>
                 <w:color w:val="000000"/>
               </w:rPr>
               <w:t>1.1</w:t>
+            </w:r>
+          </w:p>
+        </w:tc>
+      </w:tr>
+      <w:tr>
+        <w:tc>
+          <w:tcPr>
+            <w:tcW w:w="2160" w:type="dxa"/>
+            <w:tcBorders>
+              <w:bottom w:val="single" w:sz="12" w:space="0" w:color="auto"/>
+            </w:tcBorders>
+          </w:tcPr>
+          <w:p>
+            <w:pPr>
+              <w:spacing w:before="40" w:after="40"/>
+              <w:rPr>
+                <w:color w:val="000000"/>
+              </w:rPr>
+            </w:pPr>
+            <w:r>
+              <w:rPr>
+                <w:color w:val="000000"/>
+              </w:rPr>
+              <w:t>Team Developer</w:t>
+            </w:r>
+          </w:p>
+        </w:tc>
+        <w:tc>
+          <w:tcPr>
+            <w:tcW w:w="1170" w:type="dxa"/>
+            <w:tcBorders>
+              <w:bottom w:val="single" w:sz="12" w:space="0" w:color="auto"/>
+            </w:tcBorders>
+          </w:tcPr>
+          <w:p>
+            <w:pPr>
+              <w:spacing w:before="40" w:after="40"/>
+              <w:rPr>
+                <w:color w:val="000000"/>
+              </w:rPr>
+            </w:pPr>
+            <w:r>
+              <w:rPr>
+                <w:color w:val="000000"/>
+              </w:rPr>
+              <w:t>06/09/2025</w:t>
+            </w:r>
+          </w:p>
+        </w:tc>
+        <w:tc>
+          <w:tcPr>
+            <w:tcW w:w="5019" w:type="dxa"/>
+            <w:tcBorders>
+              <w:bottom w:val="single" w:sz="12" w:space="0" w:color="auto"/>
+            </w:tcBorders>
+          </w:tcPr>
+          <w:p>
+            <w:pPr>
+              <w:spacing w:before="40" w:after="40"/>
+              <w:rPr>
+                <w:color w:val="000000"/>
+              </w:rPr>
+            </w:pPr>
+            <w:r>
+              <w:rPr>
+                <w:color w:val="000000"/>
+              </w:rPr>
+              <w:t>Modificación en base a los nuevos datos existentes</w:t>
+            </w:r>
+          </w:p>
+        </w:tc>
+        <w:tc>
+          <w:tcPr>
+            <w:tcW w:w="1519" w:type="dxa"/>
+            <w:tcBorders>
+              <w:bottom w:val="single" w:sz="12" w:space="0" w:color="auto"/>
+            </w:tcBorders>
+          </w:tcPr>
+          <w:p>
+            <w:pPr>
+              <w:spacing w:before="40" w:after="40"/>
+              <w:rPr>
+                <w:color w:val="000000"/>
+              </w:rPr>
+            </w:pPr>
+            <w:r>
+              <w:rPr>
+                <w:color w:val="000000"/>
+              </w:rPr>
+              <w:t>2.0</w:t>
             </w:r>
           </w:p>
         </w:tc>
@@ -811,7 +938,13 @@
               <w:pStyle w:val="TableTextsmall"/>
             </w:pPr>
             <w:r>
-              <w:t>Cada producto debe registrarse individualmente para el control de inventario y la gestión del menú.</w:t>
+              <w:t>Cada producto</w:t>
+            </w:r>
+            <w:r>
+              <w:t xml:space="preserve"> (incluido los platillos e insumos) </w:t>
+            </w:r>
+            <w:r>
+              <w:t>debe registrarse de manera individual en el sistema para permitir un control de inventario preciso y la gestión del menú.</w:t>
             </w:r>
           </w:p>
         </w:tc>
@@ -868,6 +1001,9 @@
         <w:tc>
           <w:tcPr>
             <w:tcW w:w="676" w:type="pct"/>
+            <w:tcBorders>
+              <w:top w:val="nil"/>
+            </w:tcBorders>
           </w:tcPr>
           <w:p>
             <w:pPr>
@@ -881,32 +1017,47 @@
         <w:tc>
           <w:tcPr>
             <w:tcW w:w="2129" w:type="pct"/>
-          </w:tcPr>
-          <w:p>
-            <w:pPr>
-              <w:pStyle w:val="TableTextsmall"/>
-            </w:pPr>
-            <w:r>
-              <w:t>Los proveedores deben registrarse junto con sus facturas, pero la decisión de compra dependerá del cliente.</w:t>
+            <w:tcBorders>
+              <w:top w:val="nil"/>
+            </w:tcBorders>
+          </w:tcPr>
+          <w:p>
+            <w:pPr>
+              <w:pStyle w:val="TableTextsmall"/>
+            </w:pPr>
+            <w:r>
+              <w:t xml:space="preserve">El sistema debe mantener un inventario en tiempo real, actualizando la cantidad de insumos disponibles al registrar </w:t>
+            </w:r>
+            <w:r>
+              <w:t xml:space="preserve">cada compra </w:t>
+            </w:r>
+            <w:r>
+              <w:t>de insumos.</w:t>
             </w:r>
           </w:p>
         </w:tc>
         <w:tc>
           <w:tcPr>
             <w:tcW w:w="682" w:type="pct"/>
-          </w:tcPr>
-          <w:p>
-            <w:pPr>
-              <w:pStyle w:val="TableTextsmall"/>
-            </w:pPr>
-            <w:r>
-              <w:t xml:space="preserve">Restricción </w:t>
+            <w:tcBorders>
+              <w:top w:val="nil"/>
+            </w:tcBorders>
+          </w:tcPr>
+          <w:p>
+            <w:pPr>
+              <w:pStyle w:val="TableTextsmall"/>
+            </w:pPr>
+            <w:r>
+              <w:t>Hecho</w:t>
             </w:r>
           </w:p>
         </w:tc>
         <w:tc>
           <w:tcPr>
             <w:tcW w:w="683" w:type="pct"/>
+            <w:tcBorders>
+              <w:top w:val="nil"/>
+            </w:tcBorders>
           </w:tcPr>
           <w:p>
             <w:pPr>
@@ -920,6 +1071,9 @@
         <w:tc>
           <w:tcPr>
             <w:tcW w:w="830" w:type="pct"/>
+            <w:tcBorders>
+              <w:top w:val="nil"/>
+            </w:tcBorders>
           </w:tcPr>
           <w:p>
             <w:pPr>
@@ -941,7 +1095,10 @@
               <w:pStyle w:val="TableTextsmall"/>
             </w:pPr>
             <w:r>
-              <w:t>RN-003</w:t>
+              <w:t>RN-00</w:t>
+            </w:r>
+            <w:r>
+              <w:t>3</w:t>
             </w:r>
           </w:p>
         </w:tc>
@@ -954,21 +1111,25 @@
               <w:pStyle w:val="TableTextsmall"/>
             </w:pPr>
             <w:r>
-              <w:t xml:space="preserve">El </w:t>
-            </w:r>
-            <w:commentRangeStart w:id="6"/>
-            <w:r>
-              <w:t>margen de utilidad s</w:t>
-            </w:r>
-            <w:commentRangeEnd w:id="6"/>
-            <w:r>
-              <w:commentReference w:id="6"/>
-            </w:r>
-            <w:r>
-              <w:t>e calcula de manera automática con base en el costo del producto, el precio de venta y los impuestos a aplicar</w:t>
-            </w:r>
-            <w:r>
-              <w:t>.</w:t>
+              <w:t>Los proveedores deben registrarse</w:t>
+            </w:r>
+            <w:r>
+              <w:t xml:space="preserve"> en el sistema</w:t>
+            </w:r>
+            <w:r>
+              <w:t xml:space="preserve"> junto con su</w:t>
+            </w:r>
+            <w:r>
+              <w:t xml:space="preserve"> información y</w:t>
+            </w:r>
+            <w:r>
+              <w:t xml:space="preserve"> facturas</w:t>
+            </w:r>
+            <w:r>
+              <w:t xml:space="preserve">. </w:t>
+            </w:r>
+            <w:r>
+              <w:t>El sistema debe asociar los productos a cada proveedor para la gestión de compras y abastecimiento.</w:t>
             </w:r>
           </w:p>
         </w:tc>
@@ -1022,7 +1183,10 @@
               <w:pStyle w:val="TableTextsmall"/>
             </w:pPr>
             <w:r>
-              <w:t>RN-004</w:t>
+              <w:t>RN-00</w:t>
+            </w:r>
+            <w:r>
+              <w:t>4</w:t>
             </w:r>
           </w:p>
         </w:tc>
@@ -1035,13 +1199,36 @@
               <w:pStyle w:val="TableTextsmall"/>
             </w:pPr>
             <w:r>
-              <w:t xml:space="preserve">Generar reporten de tablas dinámicas en </w:t>
-            </w:r>
-            <w:r>
-              <w:t>Excel</w:t>
-            </w:r>
-            <w:r>
-              <w:t>.</w:t>
+              <w:t>El</w:t>
+            </w:r>
+            <w:r>
+              <w:t xml:space="preserve"> sistema calculará automáticament</w:t>
+            </w:r>
+            <w:r>
+              <w:t xml:space="preserve">e el </w:t>
+            </w:r>
+            <w:commentRangeStart w:id="6"/>
+            <w:r>
+              <w:t>margen</w:t>
+            </w:r>
+            <w:r>
+              <w:t xml:space="preserve"> de utilidad</w:t>
+            </w:r>
+            <w:commentRangeEnd w:id="6"/>
+            <w:r>
+              <w:commentReference w:id="6"/>
+            </w:r>
+            <w:r>
+              <w:t xml:space="preserve"> </w:t>
+            </w:r>
+            <w:r>
+              <w:t>para cada producto</w:t>
+            </w:r>
+            <w:r>
+              <w:t xml:space="preserve"> (sin incluir platillos e insumos)</w:t>
+            </w:r>
+            <w:r>
+              <w:t>. Este cálculo se realizará con base en el costo del producto, el precio de venta, y los impuestos aplicables. Para los productos, se utiliza un margen de utilidad estándar del 35%.</w:t>
             </w:r>
           </w:p>
         </w:tc>
@@ -1054,7 +1241,7 @@
               <w:pStyle w:val="TableTextsmall"/>
             </w:pPr>
             <w:r>
-              <w:t>Hecho</w:t>
+              <w:t xml:space="preserve">Restricción </w:t>
             </w:r>
           </w:p>
         </w:tc>
@@ -1111,7 +1298,10 @@
               <w:pStyle w:val="TableTextsmall"/>
             </w:pPr>
             <w:r>
-              <w:t>Solo el administrador tiene permisos para agregar, eliminar o modificar productos y la información del personal</w:t>
+              <w:t>El precio de los platillos no será calculado automáticamente por el sistema. El Administrador debe ingresar y actualizar el precio de venta de los platillos de forma manual, basándose en su análisis de mercado</w:t>
+            </w:r>
+            <w:r>
+              <w:t>.</w:t>
             </w:r>
           </w:p>
         </w:tc>
@@ -1165,10 +1355,10 @@
               <w:pStyle w:val="TableTextsmall"/>
             </w:pPr>
             <w:r>
-              <w:t>RN-0</w:t>
-            </w:r>
-            <w:r>
-              <w:t>06</w:t>
+              <w:t>RN-00</w:t>
+            </w:r>
+            <w:r>
+              <w:t>6</w:t>
             </w:r>
           </w:p>
         </w:tc>
@@ -1181,10 +1371,7 @@
               <w:pStyle w:val="TableTextsmall"/>
             </w:pPr>
             <w:r>
-              <w:t>Los ingresos y gastos deben registrarse diariamente para garantizar un cierre de caja al final del día.</w:t>
-            </w:r>
-            <w:r>
-              <w:t xml:space="preserve"> </w:t>
+              <w:t>El sistema debe generar reportes que se puedan exportar en formatos de tablas dinámicas, preferiblemente en Excel.</w:t>
             </w:r>
           </w:p>
         </w:tc>
@@ -1238,10 +1425,10 @@
               <w:pStyle w:val="TableTextsmall"/>
             </w:pPr>
             <w:r>
-              <w:t>RN-0</w:t>
-            </w:r>
-            <w:r>
-              <w:t>07</w:t>
+              <w:t>RN-00</w:t>
+            </w:r>
+            <w:r>
+              <w:t>7</w:t>
             </w:r>
           </w:p>
         </w:tc>
@@ -1254,10 +1441,13 @@
               <w:pStyle w:val="TableTextsmall"/>
             </w:pPr>
             <w:r>
-              <w:t>El salario de los empleados se calculará automáticamente en base a las horas trabajadas registradas.</w:t>
-            </w:r>
-            <w:r>
-              <w:t xml:space="preserve"> </w:t>
+              <w:t>Solo los usuarios con rol de Administrador tendrán permisos para agregar, editar o eliminar productos y la información del personal.</w:t>
+            </w:r>
+            <w:r>
+              <w:t xml:space="preserve"> Los Colaboradores </w:t>
+            </w:r>
+            <w:r>
+              <w:t>solo podrán registrar ventas y contratos.</w:t>
             </w:r>
           </w:p>
         </w:tc>
@@ -1270,7 +1460,7 @@
               <w:pStyle w:val="TableTextsmall"/>
             </w:pPr>
             <w:r>
-              <w:t>Hecho</w:t>
+              <w:t>Restricción</w:t>
             </w:r>
           </w:p>
         </w:tc>
@@ -1283,7 +1473,7 @@
               <w:pStyle w:val="TableTextsmall"/>
             </w:pPr>
             <w:r>
-              <w:t>Dinámico</w:t>
+              <w:t>Estático</w:t>
             </w:r>
           </w:p>
         </w:tc>
@@ -1314,7 +1504,10 @@
               <w:t>RN-0</w:t>
             </w:r>
             <w:r>
-              <w:t>08</w:t>
+              <w:t>0</w:t>
+            </w:r>
+            <w:r>
+              <w:t>8</w:t>
             </w:r>
           </w:p>
         </w:tc>
@@ -1327,10 +1520,7 @@
               <w:pStyle w:val="TableTextsmall"/>
             </w:pPr>
             <w:r>
-              <w:t>El tiquete de caja solo se emitirá si el cliente lo solicita.</w:t>
-            </w:r>
-            <w:r>
-              <w:t xml:space="preserve"> </w:t>
+              <w:t>Los ingresos y egresos del negocio deben registrarse diariamente para garantizar un cierre de caja al final de cada jornada. El sistema debe permitir el registro de las ganancias, los gastos y los faltantes/sobrantes de cada día.</w:t>
             </w:r>
           </w:p>
         </w:tc>
@@ -1343,7 +1533,7 @@
               <w:pStyle w:val="TableTextsmall"/>
             </w:pPr>
             <w:r>
-              <w:t>Restricción</w:t>
+              <w:t>Hecho</w:t>
             </w:r>
           </w:p>
         </w:tc>
@@ -1387,7 +1577,10 @@
               <w:t>RN-0</w:t>
             </w:r>
             <w:r>
-              <w:t>09</w:t>
+              <w:t>0</w:t>
+            </w:r>
+            <w:r>
+              <w:t>9</w:t>
             </w:r>
           </w:p>
         </w:tc>
@@ -1400,7 +1593,11 @@
               <w:pStyle w:val="TableTextsmall"/>
             </w:pPr>
             <w:r>
-              <w:t xml:space="preserve">La cuenta de una mesa debe de permitir dividir su cuenta si los clientes lo solicitan </w:t>
+              <w:t xml:space="preserve">El salario de los empleados se calculará automáticamente con base en las horas de asistencia y el salario por día de cada </w:t>
+            </w:r>
+            <w:r>
+              <w:lastRenderedPageBreak/>
+              <w:t>colaborador. El sistema debe registrar las horas trabajadas por día para cada empleado, las cuales se pueden registrar manualmente si el empleado no tiene acceso directo al sistema.</w:t>
             </w:r>
           </w:p>
         </w:tc>
@@ -1413,7 +1610,8 @@
               <w:pStyle w:val="TableTextsmall"/>
             </w:pPr>
             <w:r>
-              <w:t>Restricción</w:t>
+              <w:lastRenderedPageBreak/>
+              <w:t>Hecho</w:t>
             </w:r>
           </w:p>
         </w:tc>
@@ -1470,7 +1668,7 @@
               <w:pStyle w:val="TableTextsmall"/>
             </w:pPr>
             <w:r>
-              <w:t>En el control de insumos se debe registrar la cantidad comprada, la fecha de compra y la fecha de finalización para generar reportes de análisis.</w:t>
+              <w:t>El tiquete de caja solo se emitirá si el cliente lo solicita.</w:t>
             </w:r>
             <w:r>
               <w:t xml:space="preserve"> </w:t>
@@ -1486,6 +1684,155 @@
               <w:pStyle w:val="TableTextsmall"/>
             </w:pPr>
             <w:r>
+              <w:t>Restricción</w:t>
+            </w:r>
+          </w:p>
+        </w:tc>
+        <w:tc>
+          <w:tcPr>
+            <w:tcW w:w="683" w:type="pct"/>
+          </w:tcPr>
+          <w:p>
+            <w:pPr>
+              <w:pStyle w:val="TableTextsmall"/>
+            </w:pPr>
+            <w:r>
+              <w:t>Dinámico</w:t>
+            </w:r>
+          </w:p>
+        </w:tc>
+        <w:tc>
+          <w:tcPr>
+            <w:tcW w:w="830" w:type="pct"/>
+          </w:tcPr>
+          <w:p>
+            <w:pPr>
+              <w:pStyle w:val="TableTextsmall"/>
+            </w:pPr>
+            <w:r>
+              <w:t>Dueño del Restaurante</w:t>
+            </w:r>
+          </w:p>
+        </w:tc>
+      </w:tr>
+      <w:tr>
+        <w:tc>
+          <w:tcPr>
+            <w:tcW w:w="676" w:type="pct"/>
+          </w:tcPr>
+          <w:p>
+            <w:pPr>
+              <w:pStyle w:val="TableTextsmall"/>
+            </w:pPr>
+            <w:r>
+              <w:t>RN-0</w:t>
+            </w:r>
+            <w:r>
+              <w:t>1</w:t>
+            </w:r>
+            <w:r>
+              <w:t>1</w:t>
+            </w:r>
+          </w:p>
+        </w:tc>
+        <w:tc>
+          <w:tcPr>
+            <w:tcW w:w="2129" w:type="pct"/>
+          </w:tcPr>
+          <w:p>
+            <w:pPr>
+              <w:pStyle w:val="TableTextsmall"/>
+            </w:pPr>
+            <w:r>
+              <w:t>La cuenta de una venta debe permitir ser dividida entre varios métodos de pago si los clientes lo solicitan.</w:t>
+            </w:r>
+          </w:p>
+        </w:tc>
+        <w:tc>
+          <w:tcPr>
+            <w:tcW w:w="682" w:type="pct"/>
+          </w:tcPr>
+          <w:p>
+            <w:pPr>
+              <w:pStyle w:val="TableTextsmall"/>
+            </w:pPr>
+            <w:r>
+              <w:t>Restricción</w:t>
+            </w:r>
+          </w:p>
+        </w:tc>
+        <w:tc>
+          <w:tcPr>
+            <w:tcW w:w="683" w:type="pct"/>
+          </w:tcPr>
+          <w:p>
+            <w:pPr>
+              <w:pStyle w:val="TableTextsmall"/>
+            </w:pPr>
+            <w:r>
+              <w:t>Dinámico</w:t>
+            </w:r>
+          </w:p>
+        </w:tc>
+        <w:tc>
+          <w:tcPr>
+            <w:tcW w:w="830" w:type="pct"/>
+          </w:tcPr>
+          <w:p>
+            <w:pPr>
+              <w:pStyle w:val="TableTextsmall"/>
+            </w:pPr>
+            <w:r>
+              <w:t>Dueño del Restaurante</w:t>
+            </w:r>
+          </w:p>
+        </w:tc>
+      </w:tr>
+      <w:tr>
+        <w:tc>
+          <w:tcPr>
+            <w:tcW w:w="676" w:type="pct"/>
+          </w:tcPr>
+          <w:p>
+            <w:pPr>
+              <w:pStyle w:val="TableTextsmall"/>
+            </w:pPr>
+            <w:r>
+              <w:t>RN-0</w:t>
+            </w:r>
+            <w:r>
+              <w:t>1</w:t>
+            </w:r>
+            <w:r>
+              <w:t>2</w:t>
+            </w:r>
+          </w:p>
+        </w:tc>
+        <w:tc>
+          <w:tcPr>
+            <w:tcW w:w="2129" w:type="pct"/>
+          </w:tcPr>
+          <w:p>
+            <w:pPr>
+              <w:pStyle w:val="TableTextsmall"/>
+            </w:pPr>
+            <w:r>
+              <w:t>En el control de insumos se debe registrar la cantidad comprada, la fecha de compra y la fecha de vencimiento. El sistema debe emitir alertas cuando un insumo esté próximo a vencer.</w:t>
+            </w:r>
+            <w:r>
+              <w:t xml:space="preserve"> Esto para generar reportes de análisis.</w:t>
+            </w:r>
+          </w:p>
+        </w:tc>
+        <w:tc>
+          <w:tcPr>
+            <w:tcW w:w="682" w:type="pct"/>
+          </w:tcPr>
+          <w:p>
+            <w:pPr>
+              <w:pStyle w:val="TableTextsmall"/>
+            </w:pPr>
+            <w:r>
               <w:t>Hecho</w:t>
             </w:r>
           </w:p>
@@ -1513,24 +1860,295 @@
             </w:pPr>
             <w:r>
               <w:t>Dueño del Restaurante</w:t>
+            </w:r>
+          </w:p>
+        </w:tc>
+      </w:tr>
+      <w:tr>
+        <w:tc>
+          <w:tcPr>
+            <w:tcW w:w="676" w:type="pct"/>
+          </w:tcPr>
+          <w:p>
+            <w:pPr>
+              <w:pStyle w:val="TableTextsmall"/>
+            </w:pPr>
+            <w:r>
+              <w:t>RN-01</w:t>
+            </w:r>
+            <w:r>
+              <w:t>3</w:t>
+            </w:r>
+          </w:p>
+        </w:tc>
+        <w:tc>
+          <w:tcPr>
+            <w:tcW w:w="2129" w:type="pct"/>
+          </w:tcPr>
+          <w:p>
+            <w:pPr>
+              <w:pStyle w:val="TableTextsmall"/>
+            </w:pPr>
+            <w:r>
+              <w:t>El cálculo de salario para los días feriados será el doble del salario por día del empleado si el negocio abre en esa fecha. Las horas extra no se pagarán, pero se podrán ajustar dentro del horario de salida de otros días.</w:t>
+            </w:r>
+          </w:p>
+        </w:tc>
+        <w:tc>
+          <w:tcPr>
+            <w:tcW w:w="682" w:type="pct"/>
+          </w:tcPr>
+          <w:p>
+            <w:pPr>
+              <w:pStyle w:val="TableTextsmall"/>
+            </w:pPr>
+            <w:r>
+              <w:t>Hecho</w:t>
+            </w:r>
+          </w:p>
+        </w:tc>
+        <w:tc>
+          <w:tcPr>
+            <w:tcW w:w="683" w:type="pct"/>
+          </w:tcPr>
+          <w:p>
+            <w:pPr>
+              <w:pStyle w:val="TableTextsmall"/>
+            </w:pPr>
+            <w:r>
+              <w:t>Dinámico</w:t>
+            </w:r>
+          </w:p>
+        </w:tc>
+        <w:tc>
+          <w:tcPr>
+            <w:tcW w:w="830" w:type="pct"/>
+          </w:tcPr>
+          <w:p>
+            <w:pPr>
+              <w:pStyle w:val="TableTextsmall"/>
+            </w:pPr>
+            <w:r>
+              <w:t>Dueño del Restaurante</w:t>
+            </w:r>
+          </w:p>
+        </w:tc>
+      </w:tr>
+      <w:tr>
+        <w:tc>
+          <w:tcPr>
+            <w:tcW w:w="676" w:type="pct"/>
+          </w:tcPr>
+          <w:p>
+            <w:pPr>
+              <w:pStyle w:val="TableTextsmall"/>
+            </w:pPr>
+            <w:r>
+              <w:t>RN-01</w:t>
+            </w:r>
+            <w:r>
+              <w:t>4</w:t>
+            </w:r>
+          </w:p>
+        </w:tc>
+        <w:tc>
+          <w:tcPr>
+            <w:tcW w:w="2129" w:type="pct"/>
+          </w:tcPr>
+          <w:p>
+            <w:pPr>
+              <w:pStyle w:val="TableTextsmall"/>
+            </w:pPr>
+            <w:r>
+              <w:t xml:space="preserve">La gestión de contratos de comidas </w:t>
+            </w:r>
+            <w:r>
+              <w:t>debe registrar la información del cliente, los menús programados y las fechas requeridas. El sistema debe poder generar un calendario de pedidos para la cocina con base en estos contratos.</w:t>
+            </w:r>
+          </w:p>
+        </w:tc>
+        <w:tc>
+          <w:tcPr>
+            <w:tcW w:w="682" w:type="pct"/>
+          </w:tcPr>
+          <w:p>
+            <w:pPr>
+              <w:pStyle w:val="TableTextsmall"/>
+            </w:pPr>
+            <w:r>
+              <w:t>Hecho</w:t>
+            </w:r>
+          </w:p>
+        </w:tc>
+        <w:tc>
+          <w:tcPr>
+            <w:tcW w:w="683" w:type="pct"/>
+          </w:tcPr>
+          <w:p>
+            <w:pPr>
+              <w:pStyle w:val="TableTextsmall"/>
+            </w:pPr>
+            <w:r>
+              <w:t>Dinámico</w:t>
+            </w:r>
+          </w:p>
+        </w:tc>
+        <w:tc>
+          <w:tcPr>
+            <w:tcW w:w="830" w:type="pct"/>
+          </w:tcPr>
+          <w:p>
+            <w:pPr>
+              <w:pStyle w:val="TableTextsmall"/>
+            </w:pPr>
+            <w:r>
+              <w:t>Dueño del Restaurante</w:t>
+            </w:r>
+          </w:p>
+        </w:tc>
+      </w:tr>
+      <w:tr>
+        <w:tc>
+          <w:tcPr>
+            <w:tcW w:w="676" w:type="pct"/>
+          </w:tcPr>
+          <w:p>
+            <w:pPr>
+              <w:pStyle w:val="TableTextsmall"/>
+            </w:pPr>
+            <w:r>
+              <w:t>RN-01</w:t>
+            </w:r>
+            <w:r>
+              <w:t>5</w:t>
+            </w:r>
+          </w:p>
+        </w:tc>
+        <w:tc>
+          <w:tcPr>
+            <w:tcW w:w="2129" w:type="pct"/>
+          </w:tcPr>
+          <w:p>
+            <w:pPr>
+              <w:pStyle w:val="TableTextsmall"/>
+            </w:pPr>
+            <w:r>
+              <w:t>El sistema operará únicamente con la moneda local, sin conversiones a otras divisas.</w:t>
+            </w:r>
+          </w:p>
+        </w:tc>
+        <w:tc>
+          <w:tcPr>
+            <w:tcW w:w="682" w:type="pct"/>
+          </w:tcPr>
+          <w:p>
+            <w:pPr>
+              <w:pStyle w:val="TableTextsmall"/>
+            </w:pPr>
+            <w:r>
+              <w:t>Restricción</w:t>
+            </w:r>
+          </w:p>
+        </w:tc>
+        <w:tc>
+          <w:tcPr>
+            <w:tcW w:w="683" w:type="pct"/>
+          </w:tcPr>
+          <w:p>
+            <w:pPr>
+              <w:pStyle w:val="TableTextsmall"/>
+            </w:pPr>
+            <w:r>
+              <w:t>Estático</w:t>
+            </w:r>
+          </w:p>
+        </w:tc>
+        <w:tc>
+          <w:tcPr>
+            <w:tcW w:w="830" w:type="pct"/>
+          </w:tcPr>
+          <w:p>
+            <w:pPr>
+              <w:pStyle w:val="TableTextsmall"/>
+            </w:pPr>
+            <w:r>
+              <w:t>Dueño del Restaurante</w:t>
+            </w:r>
+          </w:p>
+        </w:tc>
+      </w:tr>
+      <w:tr>
+        <w:tc>
+          <w:tcPr>
+            <w:tcW w:w="676" w:type="pct"/>
+          </w:tcPr>
+          <w:p>
+            <w:pPr>
+              <w:pStyle w:val="TableTextsmall"/>
+            </w:pPr>
+            <w:r>
+              <w:t>RN-01</w:t>
+            </w:r>
+            <w:r>
+              <w:t>6</w:t>
+            </w:r>
+          </w:p>
+        </w:tc>
+        <w:tc>
+          <w:tcPr>
+            <w:tcW w:w="2129" w:type="pct"/>
+          </w:tcPr>
+          <w:p>
+            <w:pPr>
+              <w:pStyle w:val="TableTextsmall"/>
+            </w:pPr>
+            <w:r>
+              <w:t>El sistema no tendrá integraciones con plataformas de pago en línea, sistemas bancarios o de facturación electrónica. Los cobros se procesarán de forma interna dentro del sistema.</w:t>
+            </w:r>
+          </w:p>
+        </w:tc>
+        <w:tc>
+          <w:tcPr>
+            <w:tcW w:w="682" w:type="pct"/>
+          </w:tcPr>
+          <w:p>
+            <w:pPr>
+              <w:pStyle w:val="TableTextsmall"/>
+            </w:pPr>
+            <w:r>
+              <w:t>Restricción</w:t>
+            </w:r>
+          </w:p>
+        </w:tc>
+        <w:tc>
+          <w:tcPr>
+            <w:tcW w:w="683" w:type="pct"/>
+          </w:tcPr>
+          <w:p>
+            <w:pPr>
+              <w:pStyle w:val="TableTextsmall"/>
+            </w:pPr>
+            <w:r>
+              <w:t>Estático</w:t>
+            </w:r>
+          </w:p>
+        </w:tc>
+        <w:tc>
+          <w:tcPr>
+            <w:tcW w:w="830" w:type="pct"/>
+          </w:tcPr>
+          <w:p>
+            <w:pPr>
+              <w:pStyle w:val="TableTextsmall"/>
+            </w:pPr>
+            <w:r>
+              <w:t>Profesor del Curso</w:t>
             </w:r>
           </w:p>
         </w:tc>
       </w:tr>
     </w:tbl>
     <w:p/>
-    <w:p>
-      <w:pPr>
-        <w:pStyle w:val="Ttulo2"/>
-        <w:numPr>
-          <w:ilvl w:val="0"/>
-          <w:numId w:val="0"/>
-        </w:numPr>
-        <w:rPr>
-          <w:i/>
-        </w:rPr>
-      </w:pPr>
-    </w:p>
     <w:sectPr>
       <w:pgSz w:w="12240" w:h="15840"/>
       <w:pgMar w:top="1440" w:right="1440" w:bottom="1440" w:left="1440" w:header="720" w:footer="720" w:gutter="0"/>
@@ -1626,31 +2244,7 @@
       <w:pStyle w:val="Piedepgina"/>
     </w:pPr>
     <w:r>
-      <w:t xml:space="preserve">Derechos de autor © 2023 por Karl </w:t>
-    </w:r>
-    <w:proofErr w:type="spellStart"/>
-    <w:r>
-      <w:t>Wiegers</w:t>
-    </w:r>
-    <w:proofErr w:type="spellEnd"/>
-    <w:r>
-      <w:t xml:space="preserve"> y </w:t>
-    </w:r>
-    <w:proofErr w:type="spellStart"/>
-    <w:r>
-      <w:t>Seilevel</w:t>
-    </w:r>
-    <w:proofErr w:type="spellEnd"/>
-    <w:r>
-      <w:t xml:space="preserve"> </w:t>
-    </w:r>
-    <w:proofErr w:type="spellStart"/>
-    <w:r>
-      <w:t>Partners</w:t>
-    </w:r>
-    <w:proofErr w:type="spellEnd"/>
-    <w:r>
-      <w:t xml:space="preserve"> LP. Se concede permiso para usar y modificar.</w:t>
+      <w:t>Derechos de autor © 2023 por Karl Wiegers y Seilevel Partners LP. Se concede permiso para usar y modificar.</w:t>
     </w:r>
   </w:p>
 </w:ftr>
@@ -1668,31 +2262,7 @@
       <w:jc w:val="left"/>
     </w:pPr>
     <w:r>
-      <w:t xml:space="preserve">Derechos de autor © 2023 por Karl </w:t>
-    </w:r>
-    <w:proofErr w:type="spellStart"/>
-    <w:r>
-      <w:t>Wiegers</w:t>
-    </w:r>
-    <w:proofErr w:type="spellEnd"/>
-    <w:r>
-      <w:t xml:space="preserve"> y </w:t>
-    </w:r>
-    <w:proofErr w:type="spellStart"/>
-    <w:r>
-      <w:t>Seilevel</w:t>
-    </w:r>
-    <w:proofErr w:type="spellEnd"/>
-    <w:r>
-      <w:t xml:space="preserve"> </w:t>
-    </w:r>
-    <w:proofErr w:type="spellStart"/>
-    <w:r>
-      <w:t>Partners</w:t>
-    </w:r>
-    <w:proofErr w:type="spellEnd"/>
-    <w:r>
-      <w:t xml:space="preserve"> LP. Se concede permiso para usar y modificar.</w:t>
+      <w:t>Derechos de autor © 2023 por Karl Wiegers y Seilevel Partners LP. Se concede permiso para usar y modificar.</w:t>
     </w:r>
   </w:p>
 </w:ftr>

</xml_diff>